<commit_message>
rapport: corrections et nouveau dashboard grafana
</commit_message>
<xml_diff>
--- a/docs/Rapport_TP_DevOps_Kevin_Chaillot.docx
+++ b/docs/Rapport_TP_DevOps_Kevin_Chaillot.docx
@@ -89,7 +89,7 @@
         <w:spacing w:before="800"/>
         <w:jc w:val="center"/>
       </w:pPr>
-      <w:hyperlink w:history="1" r:id="rIdl30lz1e6_vi_7dj9uovl6">
+      <w:hyperlink w:history="1" r:id="rIdyq9ciqninylc0nsba_ytw">
         <w:r>
           <w:rPr>
             <w:rStyle w:val="Hyperlink"/>
@@ -516,9 +516,9 @@
       <w:r>
         <w:drawing>
           <wp:inline distT="0" distB="0" distL="0" distR="0">
-            <wp:extent cx="4953000" cy="3095625"/>
+            <wp:extent cx="4953000" cy="2705100"/>
             <wp:effectExtent t="0" r="0" b="0" l="0"/>
-            <wp:docPr id="1" name="02_app_local.png" descr="Figure 2 — L'application tourne en local, accessible sur http://localhost:8080. On voit que le backend répond (« API status: ok ») et que la base de données est connectée." title="Figure 2 — L'application tourne en local, accessible sur http://localhost:8080. On voit que le backend répond (« API status: ok ») et que la base de données est connectée."/>
+            <wp:docPr id="1" name="02_app_local.png" descr="Figure 2 — L'application tourne en local sur http://localhost:8080. L'API répond (« ok »), la base de données est connectée (db=up) et les messages enregistrés s'affichent bien." title="Figure 2 — L'application tourne en local sur http://localhost:8080. L'API répond (« ok »), la base de données est connectée (db=up) et les messages enregistrés s'affichent bien."/>
             <wp:cNvGraphicFramePr>
               <a:graphicFrameLocks xmlns:a="http://schemas.openxmlformats.org/drawingml/2006/main" noChangeAspect="1"/>
             </wp:cNvGraphicFramePr>
@@ -541,7 +541,7 @@
                   <pic:spPr bwMode="auto">
                     <a:xfrm>
                       <a:off x="0" y="0"/>
-                      <a:ext cx="4953000" cy="3095625"/>
+                      <a:ext cx="4953000" cy="2705100"/>
                     </a:xfrm>
                     <a:prstGeom prst="rect">
                       <a:avLst/>
@@ -568,7 +568,7 @@
           <w:sz w:val="18"/>
           <w:szCs w:val="18"/>
         </w:rPr>
-        <w:t xml:space="preserve">Figure 2 — L'application tourne en local, accessible sur http://localhost:8080. On voit que le backend répond (« API status: ok ») et que la base de données est connectée.</w:t>
+        <w:t xml:space="preserve">Figure 2 — L'application tourne en local sur http://localhost:8080. L'API répond (« ok »), la base de données est connectée (db=up) et les messages enregistrés s'affichent bien.</w:t>
       </w:r>
     </w:p>
     <w:p>
@@ -845,45 +845,60 @@
           <w:sz w:val="22"/>
           <w:szCs w:val="22"/>
         </w:rPr>
-        <w:t xml:space="preserve">Pour le backend j'ai utilisé une technique appelée « multi-stage build ». C'est du bonus dans le TP. L'idée : on construit l'image en deux étapes.</w:t>
-      </w:r>
-    </w:p>
-    <w:p>
-      <w:pPr>
-        <w:pStyle w:val="ListParagraph"/>
-        <w:numPr>
-          <w:ilvl w:val="0"/>
-          <w:numId w:val="2"/>
-        </w:numPr>
-        <w:spacing w:after="80" w:line="280"/>
-      </w:pPr>
-      <w:r>
-        <w:rPr>
-          <w:rFonts w:ascii="Calibri" w:cs="Calibri" w:eastAsia="Calibri" w:hAnsi="Calibri"/>
-          <w:color w:val="000000"/>
-          <w:sz w:val="22"/>
-          <w:szCs w:val="22"/>
-        </w:rPr>
-        <w:t xml:space="preserve">Première étape : on prend une image Node complète, on installe toutes les dépendances.</w:t>
-      </w:r>
-    </w:p>
-    <w:p>
-      <w:pPr>
-        <w:pStyle w:val="ListParagraph"/>
-        <w:numPr>
-          <w:ilvl w:val="0"/>
-          <w:numId w:val="2"/>
-        </w:numPr>
-        <w:spacing w:after="80" w:line="280"/>
-      </w:pPr>
-      <w:r>
-        <w:rPr>
-          <w:rFonts w:ascii="Calibri" w:cs="Calibri" w:eastAsia="Calibri" w:hAnsi="Calibri"/>
-          <w:color w:val="000000"/>
-          <w:sz w:val="22"/>
-          <w:szCs w:val="22"/>
-        </w:rPr>
-        <w:t xml:space="preserve">Deuxième étape : on prend une image Node plus petite, on ne copie QUE ce qu'il faut pour faire tourner l'app (pas les outils de compilation). Résultat : une image finale plus légère et plus sécurisée.</w:t>
+        <w:t xml:space="preserve">Pour le backend j'ai utilisé une technique appelée « multi-stage build ». C'est du bonus dans le TP. Le principe : on construit l'image en deux étapes dans le même Dockerfile.</w:t>
+      </w:r>
+    </w:p>
+    <w:p>
+      <w:pPr>
+        <w:pStyle w:val="ListParagraph"/>
+        <w:numPr>
+          <w:ilvl w:val="0"/>
+          <w:numId w:val="2"/>
+        </w:numPr>
+        <w:spacing w:after="80" w:line="280"/>
+      </w:pPr>
+      <w:r>
+        <w:rPr>
+          <w:rFonts w:ascii="Calibri" w:cs="Calibri" w:eastAsia="Calibri" w:hAnsi="Calibri"/>
+          <w:color w:val="000000"/>
+          <w:sz w:val="22"/>
+          <w:szCs w:val="22"/>
+        </w:rPr>
+        <w:t xml:space="preserve">Étape 1 (build) : on part d'une image Node Alpine, on copie le package.json et on lance npm ci --omit=dev. Résultat : un dossier node_modules propre, uniquement avec les dépendances de production.</w:t>
+      </w:r>
+    </w:p>
+    <w:p>
+      <w:pPr>
+        <w:pStyle w:val="ListParagraph"/>
+        <w:numPr>
+          <w:ilvl w:val="0"/>
+          <w:numId w:val="2"/>
+        </w:numPr>
+        <w:spacing w:after="80" w:line="280"/>
+      </w:pPr>
+      <w:r>
+        <w:rPr>
+          <w:rFonts w:ascii="Calibri" w:cs="Calibri" w:eastAsia="Calibri" w:hAnsi="Calibri"/>
+          <w:color w:val="000000"/>
+          <w:sz w:val="22"/>
+          <w:szCs w:val="22"/>
+        </w:rPr>
+        <w:t xml:space="preserve">Étape 2 (runtime) : on repart d'une image Node Alpine vide, on copie seulement ce qu'on a besoin (le node_modules et le code), on crée un utilisateur non-root pour la sécurité, et on ajoute un HEALTHCHECK pour que Docker sache si le conteneur va bien.</w:t>
+      </w:r>
+    </w:p>
+    <w:p>
+      <w:pPr>
+        <w:spacing w:after="120" w:line="300"/>
+        <w:jc w:val="both"/>
+      </w:pPr>
+      <w:r>
+        <w:rPr>
+          <w:rFonts w:ascii="Calibri" w:cs="Calibri" w:eastAsia="Calibri" w:hAnsi="Calibri"/>
+          <w:color w:val="000000"/>
+          <w:sz w:val="22"/>
+          <w:szCs w:val="22"/>
+        </w:rPr>
+        <w:t xml:space="preserve">L'intérêt : l'image finale ne contient ni le cache npm, ni les paquets de test, ni les outils de compilation. Elle est plus petite (donc plus rapide à télécharger) et plus sûre (moins de surface d'attaque).</w:t>
       </w:r>
     </w:p>
     <w:p>
@@ -1229,9 +1244,9 @@
       <w:r>
         <w:drawing>
           <wp:inline distT="0" distB="0" distL="0" distR="0">
-            <wp:extent cx="4953000" cy="3095625"/>
+            <wp:extent cx="4953000" cy="2705100"/>
             <wp:effectExtent t="0" r="0" b="0" l="0"/>
-            <wp:docPr id="1" name="01_app_prod.png" descr="Figure 6 — L'application en production, accessible via http://4.212.91.15:30080. On voit que le statut est « ok » et qu'un message a bien été enregistré en base." title="Figure 6 — L'application en production, accessible via http://4.212.91.15:30080. On voit que le statut est « ok » et qu'un message a bien été enregistré en base."/>
+            <wp:docPr id="1" name="01_app_prod.png" descr="Figure 6 — L'application en production, accessible via http://4.212.91.15:30080. Plusieurs messages ont été ajoutés depuis l'interface, ce qui prouve que tout communique correctement (frontend → backend → base de données) dans le cluster Kubernetes." title="Figure 6 — L'application en production, accessible via http://4.212.91.15:30080. Plusieurs messages ont été ajoutés depuis l'interface, ce qui prouve que tout communique correctement (frontend → backend → base de données) dans le cluster Kubernetes."/>
             <wp:cNvGraphicFramePr>
               <a:graphicFrameLocks xmlns:a="http://schemas.openxmlformats.org/drawingml/2006/main" noChangeAspect="1"/>
             </wp:cNvGraphicFramePr>
@@ -1254,7 +1269,7 @@
                   <pic:spPr bwMode="auto">
                     <a:xfrm>
                       <a:off x="0" y="0"/>
-                      <a:ext cx="4953000" cy="3095625"/>
+                      <a:ext cx="4953000" cy="2705100"/>
                     </a:xfrm>
                     <a:prstGeom prst="rect">
                       <a:avLst/>
@@ -1281,7 +1296,7 @@
           <w:sz w:val="18"/>
           <w:szCs w:val="18"/>
         </w:rPr>
-        <w:t xml:space="preserve">Figure 6 — L'application en production, accessible via http://4.212.91.15:30080. On voit que le statut est « ok » et qu'un message a bien été enregistré en base.</w:t>
+        <w:t xml:space="preserve">Figure 6 — L'application en production, accessible via http://4.212.91.15:30080. Plusieurs messages ont été ajoutés depuis l'interface, ce qui prouve que tout communique correctement (frontend → backend → base de données) dans le cluster Kubernetes.</w:t>
       </w:r>
     </w:p>
     <w:p>
@@ -1775,9 +1790,9 @@
       <w:r>
         <w:drawing>
           <wp:inline distT="0" distB="0" distL="0" distR="0">
-            <wp:extent cx="4953000" cy="3095625"/>
+            <wp:extent cx="4953000" cy="3533775"/>
             <wp:effectExtent t="0" r="0" b="0" l="0"/>
-            <wp:docPr id="1" name="07_grafana_login.png" descr="Figure 9 — La page de connexion de Grafana, accessible sur http://4.212.91.15:30090. C'est avec cet outil que je peux visualiser l'état de mes pods en temps réel." title="Figure 9 — La page de connexion de Grafana, accessible sur http://4.212.91.15:30090. C'est avec cet outil que je peux visualiser l'état de mes pods en temps réel."/>
+            <wp:docPr id="1" name="08_grafana_dashboard.png" descr="Figure 9 — Dashboard Grafana « Kubernetes / Compute Resources / Namespace (Pods) » filtré sur le namespace tp-app. On voit en live l'utilisation CPU et mémoire de chaque pod (db, backend × 2, frontend × 2) ainsi qu'un graphique sur les 30 dernières minutes." title="Figure 9 — Dashboard Grafana « Kubernetes / Compute Resources / Namespace (Pods) » filtré sur le namespace tp-app. On voit en live l'utilisation CPU et mémoire de chaque pod (db, backend × 2, frontend × 2) ainsi qu'un graphique sur les 30 dernières minutes."/>
             <wp:cNvGraphicFramePr>
               <a:graphicFrameLocks xmlns:a="http://schemas.openxmlformats.org/drawingml/2006/main" noChangeAspect="1"/>
             </wp:cNvGraphicFramePr>
@@ -1800,7 +1815,7 @@
                   <pic:spPr bwMode="auto">
                     <a:xfrm>
                       <a:off x="0" y="0"/>
-                      <a:ext cx="4953000" cy="3095625"/>
+                      <a:ext cx="4953000" cy="3533775"/>
                     </a:xfrm>
                     <a:prstGeom prst="rect">
                       <a:avLst/>
@@ -1827,7 +1842,7 @@
           <w:sz w:val="18"/>
           <w:szCs w:val="18"/>
         </w:rPr>
-        <w:t xml:space="preserve">Figure 9 — La page de connexion de Grafana, accessible sur http://4.212.91.15:30090. C'est avec cet outil que je peux visualiser l'état de mes pods en temps réel.</w:t>
+        <w:t xml:space="preserve">Figure 9 — Dashboard Grafana « Kubernetes / Compute Resources / Namespace (Pods) » filtré sur le namespace tp-app. On voit en live l'utilisation CPU et mémoire de chaque pod (db, backend × 2, frontend × 2) ainsi qu'un graphique sur les 30 dernières minutes.</w:t>
       </w:r>
     </w:p>
     <w:p>

</xml_diff>